<commit_message>
feat(bieu-mau): kiểu trình bày Mẫu 09B, 09C, 9D theo chức vụ; dòng đơn vị công tác của lãnh đạo chỉ ghi tên Công ty
- Danh mục "Kiểu trình bày biểu mẫu" (form_layouts): tiêu đề 09B theo Chi bộ hoặc Đảng ủy, ô xác nhận của chi bộ,
  chức vụ một dòng, dòng địa danh – ngày trên 9D, chữ ghi khi chức vụ trống; gắn cho chức vụ, đặt riêng được cho cán bộ
  (giao diện và cột "Kiểu trình bày biểu mẫu" của file nhập cán bộ); giá trị khởi tạo Bí thư Đảng ủy / Lãnh đạo Công ty /
  Cán bộ phòng ban theo bộ tài liệu chuẩn quý III/2026
- Template 09B, 09C, 9D: if:HAS_DEPARTMENT, if:POSITIONS_ONE_LINE, if:HAS_CELL_CONFIRMATION, if:HAS_DATE_LINE; phần ký
  không tách trang (tools/templates/fix_department_company.py, fix_form_layout.py)
- Biểu mẫu Word: cảnh báo phiên bản đang dùng thiếu tag so với file gốc
</commit_message>
<xml_diff>
--- a/backend/src/CongTacDang.Infrastructure/Templates/Word/Mau_09B_PhieuTuChamTheoTruc.docx
+++ b/backend/src/CongTacDang.Infrastructure/Templates/Word/Mau_09B_PhieuTuChamTheoTruc.docx
@@ -561,44 +561,25 @@
         </w:sdtContent>
       </w:sdt>
     </w:p>
-    <w:p>
-      <w:pPr>
-        <w:shd w:val="clear" w:color="auto" w:fill="FFFFFF" w:themeFill="background1"/>
-        <w:spacing w:before="120" w:line="240" w:lineRule="auto"/>
-        <w:ind w:left="935" w:hanging="935"/>
-        <w:jc w:val="left"/>
-        <w:rPr>
-          <w:rFonts w:eastAsia="MS Mincho"/>
-          <w:sz w:val="24"/>
-          <w:szCs w:val="24"/>
-          <w:lang w:val="en-US" w:eastAsia="en-US"/>
-        </w:rPr>
-      </w:pPr>
-      <w:r>
-        <w:rPr>
-          <w:rFonts w:eastAsia="MS Mincho"/>
-          <w:sz w:val="24"/>
-          <w:szCs w:val="24"/>
-          <w:lang w:val="en-US" w:eastAsia="en-US"/>
-        </w:rPr>
-        <w:t xml:space="preserve">Chức vụ: </w:t>
-      </w:r>
-      <w:r>
-        <w:rPr>
-          <w:rFonts w:eastAsia="MS Mincho"/>
-          <w:sz w:val="24"/>
-          <w:szCs w:val="24"/>
-          <w:lang w:val="en-US" w:eastAsia="en-US"/>
-        </w:rPr>
-        <w:t xml:space="preserve">Chức vụ Đảng: </w:t>
-      </w:r>
-      <w:sdt>
-        <w:sdtPr>
-          <w:alias w:val="PARTY_POSITION"/>
-          <w:tag w:val="PARTY_POSITION"/>
-          <w:id w:val="922036"/>
-        </w:sdtPr>
-        <w:sdtContent>
+    <w:sdt>
+      <w:sdtPr>
+        <w:alias w:val="if:POSITIONS_ONE_LINE"/>
+        <w:tag w:val="if:POSITIONS_ONE_LINE"/>
+        <w:id w:val="922044"/>
+      </w:sdtPr>
+      <w:sdtContent>
+        <w:p>
+          <w:pPr>
+            <w:shd w:val="clear" w:color="auto" w:fill="FFFFFF" w:themeFill="background1"/>
+            <w:spacing w:before="120" w:line="240" w:lineRule="auto"/>
+            <w:jc w:val="left"/>
+            <w:rPr>
+              <w:rFonts w:eastAsia="MS Mincho"/>
+              <w:sz w:val="24"/>
+              <w:szCs w:val="24"/>
+              <w:lang w:val="en-US" w:eastAsia="en-US"/>
+            </w:rPr>
+          </w:pPr>
           <w:r>
             <w:rPr>
               <w:rFonts w:eastAsia="MS Mincho"/>
@@ -606,40 +587,49 @@
               <w:szCs w:val="24"/>
               <w:lang w:val="en-US" w:eastAsia="en-US"/>
             </w:rPr>
-            <w:t xml:space="preserve">…</w:t>
+            <w:t xml:space="preserve">Chức vụ (Đảng, Đoàn thể, Chính quyền): </w:t>
           </w:r>
-        </w:sdtContent>
-      </w:sdt>
-    </w:p>
-    <w:p>
-      <w:pPr>
-        <w:shd w:val="clear" w:color="auto" w:fill="FFFFFF" w:themeFill="background1"/>
-        <w:spacing w:line="240" w:lineRule="auto"/>
-        <w:ind w:left="935"/>
-        <w:jc w:val="left"/>
-        <w:rPr>
-          <w:rFonts w:eastAsia="MS Mincho"/>
-          <w:sz w:val="24"/>
-          <w:szCs w:val="24"/>
-          <w:lang w:val="en-US" w:eastAsia="en-US"/>
-        </w:rPr>
-      </w:pPr>
-      <w:r>
-        <w:rPr>
-          <w:rFonts w:eastAsia="MS Mincho"/>
-          <w:sz w:val="24"/>
-          <w:szCs w:val="24"/>
-          <w:lang w:val="en-US" w:eastAsia="en-US"/>
-        </w:rPr>
-        <w:t xml:space="preserve">Chức vụ chính quyền: </w:t>
-      </w:r>
-      <w:sdt>
-        <w:sdtPr>
-          <w:alias w:val="ADMIN_POSITION"/>
-          <w:tag w:val="ADMIN_POSITION"/>
-          <w:id w:val="922037"/>
-        </w:sdtPr>
-        <w:sdtContent>
+          <w:sdt>
+            <w:sdtPr>
+              <w:alias w:val="POSITIONS"/>
+              <w:tag w:val="POSITIONS"/>
+              <w:id w:val="922042"/>
+            </w:sdtPr>
+            <w:sdtContent>
+              <w:r>
+                <w:rPr>
+                  <w:rFonts w:eastAsia="MS Mincho"/>
+                  <w:sz w:val="24"/>
+                  <w:szCs w:val="24"/>
+                  <w:lang w:val="en-US" w:eastAsia="en-US"/>
+                </w:rPr>
+                <w:t xml:space="preserve">…</w:t>
+              </w:r>
+            </w:sdtContent>
+          </w:sdt>
+        </w:p>
+      </w:sdtContent>
+    </w:sdt>
+    <w:sdt>
+      <w:sdtPr>
+        <w:alias w:val="ifnot:POSITIONS_ONE_LINE"/>
+        <w:tag w:val="ifnot:POSITIONS_ONE_LINE"/>
+        <w:id w:val="922043"/>
+      </w:sdtPr>
+      <w:sdtContent>
+        <w:p>
+          <w:pPr>
+            <w:shd w:val="clear" w:color="auto" w:fill="FFFFFF" w:themeFill="background1"/>
+            <w:spacing w:before="120" w:line="240" w:lineRule="auto"/>
+            <w:ind w:left="935" w:hanging="935"/>
+            <w:jc w:val="left"/>
+            <w:rPr>
+              <w:rFonts w:eastAsia="MS Mincho"/>
+              <w:sz w:val="24"/>
+              <w:szCs w:val="24"/>
+              <w:lang w:val="en-US" w:eastAsia="en-US"/>
+            </w:rPr>
+          </w:pPr>
           <w:r>
             <w:rPr>
               <w:rFonts w:eastAsia="MS Mincho"/>
@@ -647,40 +637,8 @@
               <w:szCs w:val="24"/>
               <w:lang w:val="en-US" w:eastAsia="en-US"/>
             </w:rPr>
-            <w:t xml:space="preserve">…</w:t>
+            <w:t xml:space="preserve">Chức vụ: </w:t>
           </w:r>
-        </w:sdtContent>
-      </w:sdt>
-    </w:p>
-    <w:p>
-      <w:pPr>
-        <w:shd w:val="clear" w:color="auto" w:fill="FFFFFF" w:themeFill="background1"/>
-        <w:spacing w:line="240" w:lineRule="auto"/>
-        <w:ind w:left="935"/>
-        <w:jc w:val="left"/>
-        <w:rPr>
-          <w:rFonts w:eastAsia="MS Mincho"/>
-          <w:sz w:val="24"/>
-          <w:szCs w:val="24"/>
-          <w:lang w:val="en-US" w:eastAsia="en-US"/>
-        </w:rPr>
-      </w:pPr>
-      <w:r>
-        <w:rPr>
-          <w:rFonts w:eastAsia="MS Mincho"/>
-          <w:sz w:val="24"/>
-          <w:szCs w:val="24"/>
-          <w:lang w:val="en-US" w:eastAsia="en-US"/>
-        </w:rPr>
-        <w:t xml:space="preserve">Chức vụ đoàn thể: </w:t>
-      </w:r>
-      <w:sdt>
-        <w:sdtPr>
-          <w:alias w:val="MASS_POSITION"/>
-          <w:tag w:val="MASS_POSITION"/>
-          <w:id w:val="922038"/>
-        </w:sdtPr>
-        <w:sdtContent>
           <w:r>
             <w:rPr>
               <w:rFonts w:eastAsia="MS Mincho"/>
@@ -688,11 +646,111 @@
               <w:szCs w:val="24"/>
               <w:lang w:val="en-US" w:eastAsia="en-US"/>
             </w:rPr>
-            <w:t xml:space="preserve">…</w:t>
+            <w:t xml:space="preserve">Chức vụ Đảng: </w:t>
           </w:r>
-        </w:sdtContent>
-      </w:sdt>
-    </w:p>
+          <w:sdt>
+            <w:sdtPr>
+              <w:alias w:val="PARTY_POSITION"/>
+              <w:tag w:val="PARTY_POSITION"/>
+              <w:id w:val="922036"/>
+            </w:sdtPr>
+            <w:sdtContent>
+              <w:r>
+                <w:rPr>
+                  <w:rFonts w:eastAsia="MS Mincho"/>
+                  <w:sz w:val="24"/>
+                  <w:szCs w:val="24"/>
+                  <w:lang w:val="en-US" w:eastAsia="en-US"/>
+                </w:rPr>
+                <w:t xml:space="preserve">…</w:t>
+              </w:r>
+            </w:sdtContent>
+          </w:sdt>
+        </w:p>
+        <w:p>
+          <w:pPr>
+            <w:shd w:val="clear" w:color="auto" w:fill="FFFFFF" w:themeFill="background1"/>
+            <w:spacing w:line="240" w:lineRule="auto"/>
+            <w:ind w:left="935"/>
+            <w:jc w:val="left"/>
+            <w:rPr>
+              <w:rFonts w:eastAsia="MS Mincho"/>
+              <w:sz w:val="24"/>
+              <w:szCs w:val="24"/>
+              <w:lang w:val="en-US" w:eastAsia="en-US"/>
+            </w:rPr>
+          </w:pPr>
+          <w:r>
+            <w:rPr>
+              <w:rFonts w:eastAsia="MS Mincho"/>
+              <w:sz w:val="24"/>
+              <w:szCs w:val="24"/>
+              <w:lang w:val="en-US" w:eastAsia="en-US"/>
+            </w:rPr>
+            <w:t xml:space="preserve">Chức vụ chính quyền: </w:t>
+          </w:r>
+          <w:sdt>
+            <w:sdtPr>
+              <w:alias w:val="ADMIN_POSITION"/>
+              <w:tag w:val="ADMIN_POSITION"/>
+              <w:id w:val="922037"/>
+            </w:sdtPr>
+            <w:sdtContent>
+              <w:r>
+                <w:rPr>
+                  <w:rFonts w:eastAsia="MS Mincho"/>
+                  <w:sz w:val="24"/>
+                  <w:szCs w:val="24"/>
+                  <w:lang w:val="en-US" w:eastAsia="en-US"/>
+                </w:rPr>
+                <w:t xml:space="preserve">…</w:t>
+              </w:r>
+            </w:sdtContent>
+          </w:sdt>
+        </w:p>
+        <w:p>
+          <w:pPr>
+            <w:shd w:val="clear" w:color="auto" w:fill="FFFFFF" w:themeFill="background1"/>
+            <w:spacing w:line="240" w:lineRule="auto"/>
+            <w:ind w:left="935"/>
+            <w:jc w:val="left"/>
+            <w:rPr>
+              <w:rFonts w:eastAsia="MS Mincho"/>
+              <w:sz w:val="24"/>
+              <w:szCs w:val="24"/>
+              <w:lang w:val="en-US" w:eastAsia="en-US"/>
+            </w:rPr>
+          </w:pPr>
+          <w:r>
+            <w:rPr>
+              <w:rFonts w:eastAsia="MS Mincho"/>
+              <w:sz w:val="24"/>
+              <w:szCs w:val="24"/>
+              <w:lang w:val="en-US" w:eastAsia="en-US"/>
+            </w:rPr>
+            <w:t xml:space="preserve">Chức vụ đoàn thể: </w:t>
+          </w:r>
+          <w:sdt>
+            <w:sdtPr>
+              <w:alias w:val="MASS_POSITION"/>
+              <w:tag w:val="MASS_POSITION"/>
+              <w:id w:val="922038"/>
+            </w:sdtPr>
+            <w:sdtContent>
+              <w:r>
+                <w:rPr>
+                  <w:rFonts w:eastAsia="MS Mincho"/>
+                  <w:sz w:val="24"/>
+                  <w:szCs w:val="24"/>
+                  <w:lang w:val="en-US" w:eastAsia="en-US"/>
+                </w:rPr>
+                <w:t xml:space="preserve">…</w:t>
+              </w:r>
+            </w:sdtContent>
+          </w:sdt>
+        </w:p>
+      </w:sdtContent>
+    </w:sdt>
     <w:p>
       <w:pPr>
         <w:shd w:val="clear" w:color="auto" w:fill="FFFFFF" w:themeFill="background1"/>
@@ -716,11 +774,29 @@
       </w:r>
       <w:sdt>
         <w:sdtPr>
-          <w:alias w:val="DEPARTMENT"/>
-          <w:tag w:val="DEPARTMENT"/>
-          <w:id w:val="922006"/>
+          <w:alias w:val="if:HAS_DEPARTMENT"/>
+          <w:tag w:val="if:HAS_DEPARTMENT"/>
+          <w:id w:val="922041"/>
         </w:sdtPr>
         <w:sdtContent>
+          <w:sdt>
+            <w:sdtPr>
+              <w:alias w:val="DEPARTMENT"/>
+              <w:tag w:val="DEPARTMENT"/>
+              <w:id w:val="922006"/>
+            </w:sdtPr>
+            <w:sdtContent>
+              <w:r>
+                <w:rPr>
+                  <w:rFonts w:eastAsia="MS Mincho"/>
+                  <w:sz w:val="24"/>
+                  <w:szCs w:val="24"/>
+                  <w:lang w:val="en-US" w:eastAsia="en-US"/>
+                </w:rPr>
+                <w:t xml:space="preserve">............................................................................................................... ............... ............... ............... ............... .............................</w:t>
+              </w:r>
+            </w:sdtContent>
+          </w:sdt>
           <w:r>
             <w:rPr>
               <w:rFonts w:eastAsia="MS Mincho"/>
@@ -728,19 +804,10 @@
               <w:szCs w:val="24"/>
               <w:lang w:val="en-US" w:eastAsia="en-US"/>
             </w:rPr>
-            <w:t xml:space="preserve">............................................................................................................... ............... ............... ............... ............... .............................</w:t>
+            <w:t xml:space="preserve">, </w:t>
           </w:r>
         </w:sdtContent>
       </w:sdt>
-      <w:r>
-        <w:rPr>
-          <w:rFonts w:eastAsia="MS Mincho"/>
-          <w:sz w:val="24"/>
-          <w:szCs w:val="24"/>
-          <w:lang w:val="en-US" w:eastAsia="en-US"/>
-        </w:rPr>
-        <w:t xml:space="preserve">, </w:t>
-      </w:r>
       <w:sdt>
         <w:sdtPr>
           <w:alias w:val="ORG_COMPANY_NAME"/>
@@ -3217,189 +3284,118 @@
         </w:sdtContent>
       </w:sdt>
     </w:p>
-    <w:p>
-      <w:pPr>
-        <w:spacing w:after="0"/>
-        <w:ind w:firstLine="1134"/>
-        <w:jc w:val="left"/>
-        <w:rPr>
-          <w:bCs/>
-          <w:i/>
-          <w:iCs/>
-          <w:sz w:val="20"/>
-          <w:szCs w:val="20"/>
-          <w:lang w:val="en-US"/>
-        </w:rPr>
-      </w:pPr>
-      <w:r>
-        <w:rPr>
-          <w:b/>
-          <w:sz w:val="20"/>
-          <w:szCs w:val="20"/>
-        </w:rPr>
-        <w:t>XÁC NHẬN CỦA CHI BỘ</w:t>
-      </w:r>
-      <w:r>
-        <w:rPr>
-          <w:b/>
-          <w:sz w:val="20"/>
-          <w:szCs w:val="20"/>
-          <w:lang w:val="en-US"/>
-        </w:rPr>
-        <w:t xml:space="preserve">                                                                                                                                         </w:t>
-      </w:r>
-      <w:r>
-        <w:rPr>
-          <w:rFonts w:eastAsia="MS Mincho"/>
-          <w:b/>
-          <w:bCs/>
-          <w:sz w:val="20"/>
-          <w:szCs w:val="20"/>
-          <w:lang w:val="en-US" w:eastAsia="en-US"/>
-        </w:rPr>
-        <w:t>NGƯỜI TỰ ĐÁNH GIÁ</w:t>
-      </w:r>
-      <w:r>
-        <w:rPr>
-          <w:b/>
-          <w:sz w:val="20"/>
-          <w:szCs w:val="20"/>
-        </w:rPr>
-        <w:br/>
-      </w:r>
-      <w:r>
-        <w:rPr>
-          <w:bCs/>
-          <w:i/>
-          <w:iCs/>
-          <w:sz w:val="20"/>
-          <w:szCs w:val="20"/>
-          <w:lang w:val="en-US"/>
-        </w:rPr>
-        <w:t xml:space="preserve">                   </w:t>
-      </w:r>
-      <w:r>
-        <w:rPr>
-          <w:bCs/>
-          <w:i/>
-          <w:iCs/>
-          <w:sz w:val="20"/>
-          <w:szCs w:val="20"/>
-        </w:rPr>
-        <w:t>(X</w:t>
-      </w:r>
-      <w:r>
-        <w:rPr>
-          <w:bCs/>
-          <w:i/>
-          <w:iCs/>
-          <w:sz w:val="20"/>
-          <w:szCs w:val="20"/>
-          <w:lang w:val="en-US"/>
-        </w:rPr>
-        <w:t>ác lập thời điểm, k</w:t>
-      </w:r>
-      <w:r>
-        <w:rPr>
-          <w:bCs/>
-          <w:i/>
-          <w:iCs/>
-          <w:sz w:val="20"/>
-          <w:szCs w:val="20"/>
-        </w:rPr>
-        <w:t>ý, ghi rõ họ tên)</w:t>
-      </w:r>
-      <w:r>
-        <w:rPr>
-          <w:bCs/>
-          <w:i/>
-          <w:iCs/>
-          <w:sz w:val="20"/>
-          <w:szCs w:val="20"/>
-          <w:lang w:val="en-US"/>
-        </w:rPr>
-        <w:t xml:space="preserve">                        </w:t>
-      </w:r>
-      <w:r>
-        <w:rPr>
-          <w:bCs/>
-          <w:i/>
-          <w:iCs/>
-          <w:sz w:val="20"/>
-          <w:szCs w:val="20"/>
-          <w:lang w:val="en-US"/>
-        </w:rPr>
-        <w:tab/>
-      </w:r>
-      <w:r>
-        <w:rPr>
-          <w:bCs/>
-          <w:i/>
-          <w:iCs/>
-          <w:sz w:val="20"/>
-          <w:szCs w:val="20"/>
-          <w:lang w:val="en-US"/>
-        </w:rPr>
-        <w:tab/>
-      </w:r>
-      <w:r>
-        <w:rPr>
-          <w:bCs/>
-          <w:i/>
-          <w:iCs/>
-          <w:sz w:val="20"/>
-          <w:szCs w:val="20"/>
-          <w:lang w:val="en-US"/>
-        </w:rPr>
-        <w:tab/>
-      </w:r>
-      <w:r>
-        <w:rPr>
-          <w:bCs/>
-          <w:i/>
-          <w:iCs/>
-          <w:sz w:val="20"/>
-          <w:szCs w:val="20"/>
-          <w:lang w:val="en-US"/>
-        </w:rPr>
-        <w:tab/>
-      </w:r>
-      <w:r>
-        <w:rPr>
-          <w:bCs/>
-          <w:i/>
-          <w:iCs/>
-          <w:sz w:val="20"/>
-          <w:szCs w:val="20"/>
-          <w:lang w:val="en-US"/>
-        </w:rPr>
-        <w:tab/>
-      </w:r>
-      <w:r>
-        <w:rPr>
-          <w:bCs/>
-          <w:i/>
-          <w:iCs/>
-          <w:sz w:val="20"/>
-          <w:szCs w:val="20"/>
-          <w:lang w:val="en-US"/>
-        </w:rPr>
-        <w:tab/>
-        <w:t xml:space="preserve">                    </w:t>
-      </w:r>
-      <w:r>
-        <w:rPr>
-          <w:rFonts w:eastAsia="MS Mincho"/>
-          <w:bCs/>
-          <w:i/>
-          <w:iCs/>
-          <w:sz w:val="20"/>
-          <w:szCs w:val="20"/>
-          <w:lang w:val="en-US" w:eastAsia="en-US"/>
-        </w:rPr>
-        <w:t>(Ký, ghi rõ họ tên)</w:t>
-      </w:r>
-    </w:p>
+    <w:tbl>
+      <w:tblPr>
+        <w:tblW w:w="15136" w:type="dxa"/>
+        <w:tblBorders>
+          <w:top w:val="nil"/>
+          <w:left w:val="nil"/>
+          <w:bottom w:val="nil"/>
+          <w:right w:val="nil"/>
+          <w:insideH w:val="nil"/>
+          <w:insideV w:val="nil"/>
+        </w:tblBorders>
+        <w:tblLayout w:type="fixed"/>
+        <w:tblLook w:val="0000" w:firstRow="0" w:lastRow="0" w:firstColumn="0" w:lastColumn="0" w:noHBand="1" w:noVBand="1"/>
+      </w:tblPr>
+      <w:tblGrid>
+        <w:gridCol w:w="7568"/>
+        <w:gridCol w:w="7568"/>
+      </w:tblGrid>
+      <w:tr>
+        <w:trPr>
+          <w:cantSplit/>
+        </w:trPr>
+        <w:tc>
+          <w:tcPr>
+            <w:tcW w:w="7568" w:type="dxa"/>
+          </w:tcPr>
+          <w:p>
+            <w:pPr>
+              <w:spacing w:before="0" w:after="0"/>
+              <w:jc w:val="center"/>
+            </w:pPr>
+            <w:sdt>
+              <w:sdtPr>
+                <w:alias w:val="if:HAS_CELL_CONFIRMATION"/>
+                <w:tag w:val="if:HAS_CELL_CONFIRMATION"/>
+                <w:id w:val="922045"/>
+              </w:sdtPr>
+              <w:sdtContent>
+                <w:r>
+                  <w:rPr>
+                    <w:b/>
+                    <w:sz w:val="20"/>
+                    <w:szCs w:val="20"/>
+                  </w:rPr>
+                  <w:t xml:space="preserve">XÁC NHẬN CỦA CHI BỘ</w:t>
+                </w:r>
+              </w:sdtContent>
+            </w:sdt>
+          </w:p>
+          <w:p>
+            <w:pPr>
+              <w:spacing w:before="0" w:after="0"/>
+              <w:jc w:val="center"/>
+            </w:pPr>
+            <w:sdt>
+              <w:sdtPr>
+                <w:alias w:val="if:HAS_CELL_CONFIRMATION"/>
+                <w:tag w:val="if:HAS_CELL_CONFIRMATION"/>
+                <w:id w:val="922046"/>
+              </w:sdtPr>
+              <w:sdtContent>
+                <w:r>
+                  <w:rPr>
+                    <w:bCs/>
+                    <w:i/>
+                    <w:iCs/>
+                    <w:sz w:val="20"/>
+                    <w:szCs w:val="20"/>
+                  </w:rPr>
+                  <w:t xml:space="preserve">(Xác lập thời điểm, ký, ghi rõ họ tên)</w:t>
+                </w:r>
+              </w:sdtContent>
+            </w:sdt>
+          </w:p>
+        </w:tc>
+        <w:tc>
+          <w:tcPr>
+            <w:tcW w:w="7568" w:type="dxa"/>
+          </w:tcPr>
+          <w:p>
+            <w:pPr>
+              <w:spacing w:before="0" w:after="0"/>
+              <w:jc w:val="center"/>
+            </w:pPr>
+            <w:r>
+              <w:rPr>
+                <w:b/>
+                <w:sz w:val="20"/>
+                <w:szCs w:val="20"/>
+              </w:rPr>
+              <w:t xml:space="preserve">NGƯỜI TỰ ĐÁNH GIÁ</w:t>
+            </w:r>
+          </w:p>
+          <w:p>
+            <w:pPr>
+              <w:spacing w:before="0" w:after="0"/>
+              <w:jc w:val="center"/>
+            </w:pPr>
+            <w:r>
+              <w:rPr>
+                <w:bCs/>
+                <w:i/>
+                <w:iCs/>
+                <w:sz w:val="20"/>
+                <w:szCs w:val="20"/>
+              </w:rPr>
+              <w:t xml:space="preserve">(Ký, ghi rõ họ tên)</w:t>
+            </w:r>
+          </w:p>
+        </w:tc>
+      </w:tr>
+    </w:tbl>
     <w:p>
       <w:pPr>
         <w:spacing w:after="0"/>

</xml_diff>